<commit_message>
feat: streamline Ask the Library pilot operator flow
</commit_message>
<xml_diff>
--- a/docs/ask-library-pilot/Ask-the-Library-Pilot-Participant-Quick-Start.docx
+++ b/docs/ask-library-pilot/Ask-the-Library-Pilot-Participant-Quick-Start.docx
@@ -60,7 +60,7 @@
           <w:color w:val="FFFFFF"/>
           <w:sz w:val="21"/>
         </w:rPr>
-        <w:t>No setup is required. Use the tool with the pilot lead on a shared laptop or through a Baylor Teams screen share. Over 14 days, bring three real questions, review each brief in about two minutes, and complete about one minute of feedback.</w:t>
+        <w:t>Your role is simple: ask, read, and rate. Enter one de-identified question, read the finished answer, and complete about one minute of feedback. The pilot lead handles Codex and all files.</w:t>
       </w:r>
     </w:p>
     <w:p>
@@ -206,7 +206,7 @@
         <w:pStyle w:val="Heading1"/>
       </w:pPr>
       <w:r>
-        <w:t>During the session</w:t>
+        <w:t>During the session: ask, read, rate</w:t>
       </w:r>
     </w:p>
     <w:p>
@@ -224,7 +224,7 @@
           <w:color w:val="0B2B21"/>
           <w:sz w:val="21"/>
         </w:rPr>
-        <w:t xml:space="preserve">Enter the question. </w:t>
+        <w:t xml:space="preserve">Ask. </w:t>
       </w:r>
       <w:r>
         <w:rPr>
@@ -232,7 +232,7 @@
           <w:color w:val="202722"/>
           <w:sz w:val="21"/>
         </w:rPr>
-        <w:t>You or the pilot lead enters the de-identified question and only the context that could change the answer.</w:t>
+        <w:t>Copy an assigned prompt or enter another de-identified question, add the context that matters, and select Save question for Codex. The pilot lead handles the downloaded file.</w:t>
       </w:r>
     </w:p>
     <w:p>
@@ -250,7 +250,7 @@
           <w:color w:val="0B2B21"/>
           <w:sz w:val="21"/>
         </w:rPr>
-        <w:t xml:space="preserve">Receive the brief. </w:t>
+        <w:t xml:space="preserve">Read. </w:t>
       </w:r>
       <w:r>
         <w:rPr>
@@ -258,7 +258,7 @@
           <w:color w:val="202722"/>
           <w:sz w:val="21"/>
         </w:rPr>
-        <w:t>The pilot lead searches the Evidence Library and checks the claims against original sources.</w:t>
+        <w:t>The pilot lead asks Codex to prepare and check the answer, then opens the finished brief. Start with Bottom Line, Recommended Direction or Decision Boundary, Evidence Confidence, and Guardrails.</w:t>
       </w:r>
     </w:p>
     <w:p>
@@ -276,7 +276,7 @@
           <w:color w:val="0B2B21"/>
           <w:sz w:val="21"/>
         </w:rPr>
-        <w:t xml:space="preserve">Read in decision order. </w:t>
+        <w:t xml:space="preserve">Rate. </w:t>
       </w:r>
       <w:r>
         <w:rPr>
@@ -284,33 +284,32 @@
           <w:color w:val="202722"/>
           <w:sz w:val="21"/>
         </w:rPr>
-        <w:t>Start with Bottom Line, Recommended Direction or Decision Boundary, Evidence Confidence, and Guardrails. Inspect source excerpts when useful.</w:t>
+        <w:t>Complete the short feedback form: Did it help? Did it affect the decision? What was missing? How long did it take to understand?</w:t>
       </w:r>
     </w:p>
     <w:p>
       <w:pPr>
-        <w:numPr>
-          <w:ilvl w:val="0"/>
-          <w:numId w:val="11"/>
-        </w:numPr>
-        <w:spacing w:before="0" w:after="80" w:line="276" w:lineRule="auto"/>
+        <w:spacing w:before="100" w:after="80" w:line="264" w:lineRule="auto"/>
+        <w:ind w:left="230" w:right="230"/>
+        <w:shd w:fill="E8F0EC" w:val="clear"/>
       </w:pPr>
       <w:r>
         <w:rPr>
           <w:rFonts w:ascii="Calibri" w:hAnsi="Calibri"/>
           <w:b/>
-          <w:color w:val="0B2B21"/>
-          <w:sz w:val="21"/>
+          <w:color w:val="154734"/>
+          <w:sz w:val="18"/>
         </w:rPr>
-        <w:t xml:space="preserve">Give brief feedback. </w:t>
+        <w:t xml:space="preserve">THAT IS YOUR WHOLE ROLE  </w:t>
       </w:r>
       <w:r>
         <w:rPr>
           <w:rFonts w:ascii="Calibri" w:hAnsi="Calibri"/>
+          <w:b/>
           <w:color w:val="202722"/>
-          <w:sz w:val="21"/>
+          <w:sz w:val="19"/>
         </w:rPr>
-        <w:t>Record usefulness, decision effect, clarity, confidence calibration, missing information, and time to understanding.</w:t>
+        <w:t>You do not need to use Codex, manage JSON files, open GitHub, or run commands.</w:t>
       </w:r>
     </w:p>
     <w:p>

</xml_diff>